<commit_message>
Bavarian Cooking: Kindle master updated after the photo and table passes.
</commit_message>
<xml_diff>
--- a/Bavarian  Cooking/Bavarian Cooking Made Simple (Kindle).docx
+++ b/Bavarian  Cooking/Bavarian Cooking Made Simple (Kindle).docx
@@ -2011,6 +2011,32 @@
         </w:r>
       </w:hyperlink>
     </w:p>
+    <w:p>
+      <w:pPr>
+        <w:pStyle w:val="TOCChapter"/>
+      </w:pPr>
+      <w:hyperlink w:anchor="chab">
+        <w:r>
+          <w:rPr>
+            <w:rStyle w:val="Hyperlink"/>
+          </w:rPr>
+          <w:t xml:space="preserve">About the Author</w:t>
+        </w:r>
+      </w:hyperlink>
+    </w:p>
+    <w:p>
+      <w:pPr>
+        <w:pStyle w:val="TOCChapter"/>
+      </w:pPr>
+      <w:hyperlink w:anchor="chbl">
+        <w:r>
+          <w:rPr>
+            <w:rStyle w:val="Hyperlink"/>
+          </w:rPr>
+          <w:t xml:space="preserve">About This Book</w:t>
+        </w:r>
+      </w:hyperlink>
+    </w:p>
     <w:bookmarkEnd w:id="15"/>
     <w:bookmarkStart w:id="75" w:name="ch1"/>
     <w:p>
@@ -55507,7 +55533,7 @@
     <w:p>
       <w:pPr>
         <w:pStyle w:val="FirstParagraph"/>
-        <w:spacing w:after="320" w:before="1600"/>
+        <w:spacing w:after="320" w:before="1200"/>
         <w:ind w:left="432" w:right="432"/>
         <w:jc w:val="center"/>
       </w:pPr>
@@ -55561,6 +55587,124 @@
       </w:r>
     </w:p>
     <w:bookmarkEnd w:id="515"/>
+    <w:bookmarkStart w:id="516" w:name="chab"/>
+    <w:p>
+      <w:pPr>
+        <w:pStyle w:val="Heading1"/>
+        <w:pageBreakBefore/>
+        <w:spacing w:before="0"/>
+      </w:pPr>
+      <w:r>
+        <w:rPr>
+          <w:sz w:val="48"/>
+        </w:rPr>
+        <w:t xml:space="preserve">About the Author</w:t>
+      </w:r>
+    </w:p>
+    <w:p>
+      <w:pPr>
+        <w:pStyle w:val="FirstParagraph"/>
+        <w:spacing w:after="320" w:before="1200"/>
+        <w:ind w:left="432" w:right="432"/>
+        <w:jc w:val="center"/>
+      </w:pPr>
+      <w:r>
+        <w:rPr>
+          <w:sz w:val="24"/>
+        </w:rPr>
+        <w:t xml:space="preserve">Annette Tauber grew up in Bavaria, and she still misses the Oktoberfest: the roasting chickens, the warm pretzels, the music and the laughter. In her own kitchen, she brings those flavors home for her husband and four children, who look forward to every family meal. Bavarian Cooking Made Simple collects the dishes she loves, written so that any cook can enjoy a taste of Bavaria.</w:t>
+      </w:r>
+    </w:p>
+    <w:bookmarkEnd w:id="516"/>
+    <w:bookmarkStart w:id="517" w:name="chbl"/>
+    <w:p>
+      <w:pPr>
+        <w:pStyle w:val="Heading1"/>
+        <w:pageBreakBefore/>
+        <w:spacing w:before="0"/>
+      </w:pPr>
+      <w:r>
+        <w:rPr>
+          <w:sz w:val="48"/>
+        </w:rPr>
+        <w:t xml:space="preserve">About This Book</w:t>
+      </w:r>
+    </w:p>
+    <w:p>
+      <w:pPr>
+        <w:pStyle w:val="FirstParagraph"/>
+        <w:spacing w:after="320" w:before="1200"/>
+        <w:ind w:left="432" w:right="432"/>
+        <w:jc w:val="center"/>
+      </w:pPr>
+      <w:r>
+        <w:rPr>
+          <w:b/>
+          <w:bCs/>
+          <w:sz w:val="24"/>
+        </w:rPr>
+        <w:t xml:space="preserve">Taste Bavaria at your own table.</w:t>
+      </w:r>
+    </w:p>
+    <w:p>
+      <w:pPr>
+        <w:pStyle w:val="BodyText"/>
+        <w:spacing w:after="320" w:before="0"/>
+        <w:ind w:left="432" w:right="432"/>
+        <w:jc w:val="center"/>
+      </w:pPr>
+      <w:r>
+        <w:rPr>
+          <w:sz w:val="24"/>
+        </w:rPr>
+        <w:t xml:space="preserve">From crackling roast pork and creamy Kässpätzle to golden Kaiserschmarrn and a proper Weißwurst breakfast, Bavarian Cooking Made Simple brings more than 120 southern German classics into your kitchen. These are the dishes of the beer garden, the Alpine hut and the Sunday table, not only the Oktoberfest.</w:t>
+      </w:r>
+    </w:p>
+    <w:p>
+      <w:pPr>
+        <w:pStyle w:val="BodyText"/>
+        <w:spacing w:after="320" w:before="0"/>
+        <w:ind w:left="432" w:right="432"/>
+        <w:jc w:val="center"/>
+      </w:pPr>
+      <w:r>
+        <w:rPr>
+          <w:sz w:val="24"/>
+        </w:rPr>
+        <w:t xml:space="preserve">Every recipe is written for four people, with a photo and the German name. Ingredients are listed in US and metric units, and the clear, step-by-step instructions work for beginners and confident cooks alike. Soups, main courses, sides, bakes, desserts and winter drinks fill the pages.</w:t>
+      </w:r>
+    </w:p>
+    <w:p>
+      <w:pPr>
+        <w:pStyle w:val="BodyText"/>
+        <w:spacing w:after="320" w:before="0"/>
+        <w:ind w:left="432" w:right="432"/>
+        <w:jc w:val="center"/>
+      </w:pPr>
+      <w:r>
+        <w:rPr>
+          <w:sz w:val="24"/>
+        </w:rPr>
+        <w:t xml:space="preserve">Cook it, share it, enjoy it.</w:t>
+      </w:r>
+    </w:p>
+    <w:p>
+      <w:pPr>
+        <w:pStyle w:val="BodyText"/>
+        <w:spacing w:after="320" w:before="0"/>
+        <w:ind w:left="432" w:right="432"/>
+        <w:jc w:val="center"/>
+      </w:pPr>
+      <w:r>
+        <w:rPr>
+          <w:b/>
+          <w:bCs/>
+          <w:sz w:val="24"/>
+        </w:rPr>
+        <w:t xml:space="preserve">Guten Appetit!</w:t>
+      </w:r>
+    </w:p>
+    <w:bookmarkEnd w:id="517"/>
     <w:sectPr>
       <w:footnotePr>
         <w:numRestart w:val="eachSect"/>

</xml_diff>

<commit_message>
Bavarian Cooking: Kindle master updated after the photo and table passes [from book-2-lectures-after-qed cb8564b, path only].
</commit_message>
<xml_diff>
--- a/Bavarian  Cooking/Bavarian Cooking Made Simple (Kindle).docx
+++ b/Bavarian  Cooking/Bavarian Cooking Made Simple (Kindle).docx
@@ -2011,6 +2011,32 @@
         </w:r>
       </w:hyperlink>
     </w:p>
+    <w:p>
+      <w:pPr>
+        <w:pStyle w:val="TOCChapter"/>
+      </w:pPr>
+      <w:hyperlink w:anchor="chab">
+        <w:r>
+          <w:rPr>
+            <w:rStyle w:val="Hyperlink"/>
+          </w:rPr>
+          <w:t xml:space="preserve">About the Author</w:t>
+        </w:r>
+      </w:hyperlink>
+    </w:p>
+    <w:p>
+      <w:pPr>
+        <w:pStyle w:val="TOCChapter"/>
+      </w:pPr>
+      <w:hyperlink w:anchor="chbl">
+        <w:r>
+          <w:rPr>
+            <w:rStyle w:val="Hyperlink"/>
+          </w:rPr>
+          <w:t xml:space="preserve">About This Book</w:t>
+        </w:r>
+      </w:hyperlink>
+    </w:p>
     <w:bookmarkEnd w:id="15"/>
     <w:bookmarkStart w:id="75" w:name="ch1"/>
     <w:p>
@@ -55507,7 +55533,7 @@
     <w:p>
       <w:pPr>
         <w:pStyle w:val="FirstParagraph"/>
-        <w:spacing w:after="320" w:before="1600"/>
+        <w:spacing w:after="320" w:before="1200"/>
         <w:ind w:left="432" w:right="432"/>
         <w:jc w:val="center"/>
       </w:pPr>
@@ -55561,6 +55587,124 @@
       </w:r>
     </w:p>
     <w:bookmarkEnd w:id="515"/>
+    <w:bookmarkStart w:id="516" w:name="chab"/>
+    <w:p>
+      <w:pPr>
+        <w:pStyle w:val="Heading1"/>
+        <w:pageBreakBefore/>
+        <w:spacing w:before="0"/>
+      </w:pPr>
+      <w:r>
+        <w:rPr>
+          <w:sz w:val="48"/>
+        </w:rPr>
+        <w:t xml:space="preserve">About the Author</w:t>
+      </w:r>
+    </w:p>
+    <w:p>
+      <w:pPr>
+        <w:pStyle w:val="FirstParagraph"/>
+        <w:spacing w:after="320" w:before="1200"/>
+        <w:ind w:left="432" w:right="432"/>
+        <w:jc w:val="center"/>
+      </w:pPr>
+      <w:r>
+        <w:rPr>
+          <w:sz w:val="24"/>
+        </w:rPr>
+        <w:t xml:space="preserve">Annette Tauber grew up in Bavaria, and she still misses the Oktoberfest: the roasting chickens, the warm pretzels, the music and the laughter. In her own kitchen, she brings those flavors home for her husband and four children, who look forward to every family meal. Bavarian Cooking Made Simple collects the dishes she loves, written so that any cook can enjoy a taste of Bavaria.</w:t>
+      </w:r>
+    </w:p>
+    <w:bookmarkEnd w:id="516"/>
+    <w:bookmarkStart w:id="517" w:name="chbl"/>
+    <w:p>
+      <w:pPr>
+        <w:pStyle w:val="Heading1"/>
+        <w:pageBreakBefore/>
+        <w:spacing w:before="0"/>
+      </w:pPr>
+      <w:r>
+        <w:rPr>
+          <w:sz w:val="48"/>
+        </w:rPr>
+        <w:t xml:space="preserve">About This Book</w:t>
+      </w:r>
+    </w:p>
+    <w:p>
+      <w:pPr>
+        <w:pStyle w:val="FirstParagraph"/>
+        <w:spacing w:after="320" w:before="1200"/>
+        <w:ind w:left="432" w:right="432"/>
+        <w:jc w:val="center"/>
+      </w:pPr>
+      <w:r>
+        <w:rPr>
+          <w:b/>
+          <w:bCs/>
+          <w:sz w:val="24"/>
+        </w:rPr>
+        <w:t xml:space="preserve">Taste Bavaria at your own table.</w:t>
+      </w:r>
+    </w:p>
+    <w:p>
+      <w:pPr>
+        <w:pStyle w:val="BodyText"/>
+        <w:spacing w:after="320" w:before="0"/>
+        <w:ind w:left="432" w:right="432"/>
+        <w:jc w:val="center"/>
+      </w:pPr>
+      <w:r>
+        <w:rPr>
+          <w:sz w:val="24"/>
+        </w:rPr>
+        <w:t xml:space="preserve">From crackling roast pork and creamy Kässpätzle to golden Kaiserschmarrn and a proper Weißwurst breakfast, Bavarian Cooking Made Simple brings more than 120 southern German classics into your kitchen. These are the dishes of the beer garden, the Alpine hut and the Sunday table, not only the Oktoberfest.</w:t>
+      </w:r>
+    </w:p>
+    <w:p>
+      <w:pPr>
+        <w:pStyle w:val="BodyText"/>
+        <w:spacing w:after="320" w:before="0"/>
+        <w:ind w:left="432" w:right="432"/>
+        <w:jc w:val="center"/>
+      </w:pPr>
+      <w:r>
+        <w:rPr>
+          <w:sz w:val="24"/>
+        </w:rPr>
+        <w:t xml:space="preserve">Every recipe is written for four people, with a photo and the German name. Ingredients are listed in US and metric units, and the clear, step-by-step instructions work for beginners and confident cooks alike. Soups, main courses, sides, bakes, desserts and winter drinks fill the pages.</w:t>
+      </w:r>
+    </w:p>
+    <w:p>
+      <w:pPr>
+        <w:pStyle w:val="BodyText"/>
+        <w:spacing w:after="320" w:before="0"/>
+        <w:ind w:left="432" w:right="432"/>
+        <w:jc w:val="center"/>
+      </w:pPr>
+      <w:r>
+        <w:rPr>
+          <w:sz w:val="24"/>
+        </w:rPr>
+        <w:t xml:space="preserve">Cook it, share it, enjoy it.</w:t>
+      </w:r>
+    </w:p>
+    <w:p>
+      <w:pPr>
+        <w:pStyle w:val="BodyText"/>
+        <w:spacing w:after="320" w:before="0"/>
+        <w:ind w:left="432" w:right="432"/>
+        <w:jc w:val="center"/>
+      </w:pPr>
+      <w:r>
+        <w:rPr>
+          <w:b/>
+          <w:bCs/>
+          <w:sz w:val="24"/>
+        </w:rPr>
+        <w:t xml:space="preserve">Guten Appetit!</w:t>
+      </w:r>
+    </w:p>
+    <w:bookmarkEnd w:id="517"/>
     <w:sectPr>
       <w:footnotePr>
         <w:numRestart w:val="eachSect"/>

</xml_diff>